<commit_message>
W09: What Monday Asks For slide; MC 501 template example uses %>%, not |>
Co-Authored-By: Claude Opus 5.5 <noreply@anthropic.com>
</commit_message>
<xml_diff>
--- a/resources/templates/MC501-codebook-template.docx
+++ b/resources/templates/MC501-codebook-template.docx
@@ -1557,7 +1557,7 @@
         <w:rPr>
           <w:rStyle w:val="SpecialCharTok"/>
         </w:rPr>
-        <w:t xml:space="preserve">|&gt;</w:t>
+        <w:t xml:space="preserve">%&gt;%</w:t>
       </w:r>
       <w:r>
         <w:br/>
@@ -1620,7 +1620,7 @@
         <w:rPr>
           <w:rStyle w:val="SpecialCharTok"/>
         </w:rPr>
-        <w:t xml:space="preserve">|&gt;</w:t>
+        <w:t xml:space="preserve">%&gt;%</w:t>
       </w:r>
       <w:r>
         <w:br/>

</xml_diff>